<commit_message>
sửa lại cách đọc bảng
</commit_message>
<xml_diff>
--- a/ARCHITECTURE.docx
+++ b/ARCHITECTURE.docx
@@ -1485,15 +1485,8 @@
             <w:shd w:fill="F1F5F8"/>
           </w:tcPr>
           <w:p>
-            <w:pPr>
-              <w:spacing w:after="40"/>
-            </w:pPr>
             <w:r>
-              <w:rPr>
-                <w:rFonts w:ascii="Aptos" w:hAnsi="Aptos" w:eastAsia="Aptos"/>
-                <w:sz w:val="17"/>
-              </w:rPr>
-              <w:t>Dò lưới → cắt ô → đọc từng hàng từ trái sang phải</w:t>
+              <w:t>Khôi phục mép trên nếu đường viền ngang và hai cạnh dọc xác nhận → dò lưới → cắt ô → đọc từng hàng từ trái sang phải</w:t>
             </w:r>
           </w:p>
         </w:tc>
@@ -1544,15 +1537,8 @@
             <w:shd w:fill="F1F5F8"/>
           </w:tcPr>
           <w:p>
-            <w:pPr>
-              <w:spacing w:after="40"/>
-            </w:pPr>
             <w:r>
-              <w:rPr>
-                <w:rFonts w:ascii="Aptos" w:hAnsi="Aptos" w:eastAsia="Aptos"/>
-                <w:sz w:val="17"/>
-              </w:rPr>
-              <w:t>Dùng dòng chữ phát hiện được, sắp theo hàng/cột thay vì áp một lưới cột toàn bảng</w:t>
+              <w:t>DocLayout khoanh v?ng b?ng ? OpenCV chia khung th?nh ? ? PP-OCR ph?t hi?n v? tr? d?ng v? g?n v?o ? ? Tesseract nh?n d?ng t?ng d?ng trong crop ?</w:t>
             </w:r>
           </w:p>
         </w:tc>

</xml_diff>